<commit_message>
ajuste no nome do arquivo gerado, preenchimento de data formatada, e inclusão de 2 campos
</commit_message>
<xml_diff>
--- a/public/moldeanamnese.docx
+++ b/public/moldeanamnese.docx
@@ -177,23 +177,32 @@
           <w:lang w:val="pt-BR"/>
         </w:rPr>
         <w:t xml:space="preserve"> </w:t>
+      </w:r>
+      <w:r>
+        <w:rPr>
+          <w:rFonts w:cs="Arial"/>
+          <w:lang w:val="pt-BR"/>
+        </w:rPr>
+        <w:t>{ra}</w:t>
+      </w:r>
+      <w:r>
+        <w:rPr>
+          <w:rFonts w:cs="Arial"/>
+          <w:lang w:val="pt-BR"/>
+        </w:rPr>
         <w:tab/>
-        <w:tab/>
-      </w:r>
-      <w:r>
-        <w:rPr>
-          <w:rFonts w:cs="Arial"/>
-          <w:b/>
-          <w:bCs/>
-          <w:lang w:val="pt-BR"/>
-        </w:rPr>
-        <w:t xml:space="preserve"> </w:t>
-      </w:r>
-      <w:r>
-        <w:rPr>
-          <w:rFonts w:cs="Arial"/>
-        </w:rPr>
-        <w:t>ANO/NÍVEL:</w:t>
+      </w:r>
+      <w:r>
+        <w:rPr>
+          <w:rFonts w:cs="Arial"/>
+        </w:rPr>
+        <w:t xml:space="preserve">ANO/NÍVEL: </w:t>
+      </w:r>
+      <w:r>
+        <w:rPr>
+          <w:rFonts w:cs="Arial"/>
+        </w:rPr>
+        <w:t>{anoNivel}</w:t>
       </w:r>
     </w:p>
     <w:p>
@@ -388,13 +397,7 @@
         <w:rPr>
           <w:rFonts w:cs="Arial"/>
         </w:rPr>
-        <w:t xml:space="preserve">TEM IRMÃOS? </w:t>
-      </w:r>
-      <w:r>
-        <w:rPr>
-          <w:rFonts w:cs="Arial"/>
-        </w:rPr>
-        <w:t>{temIrmaos ? “SIM” : “NÃO”}</w:t>
+        <w:t>TEM IRMÃOS? {temIrmaos ? “SIM” : “NÃO”}</w:t>
       </w:r>
     </w:p>
     <w:p>
@@ -409,13 +412,7 @@
         <w:rPr>
           <w:rFonts w:cs="Arial"/>
         </w:rPr>
-        <w:t xml:space="preserve">NECESSITAM DE ATENDIMENTO ESPECIALIZADO? </w:t>
-      </w:r>
-      <w:r>
-        <w:rPr>
-          <w:rFonts w:cs="Arial"/>
-        </w:rPr>
-        <w:t>{necessitamAtenEsp ? “SIM” : “NÃO”}</w:t>
+        <w:t>NECESSITAM DE ATENDIMENTO ESPECIALIZADO? {necessitamAtenEsp ? “SIM” : “NÃO”}</w:t>
       </w:r>
     </w:p>
     <w:p>
@@ -478,21 +475,7 @@
           <w:rFonts w:cs="Arial"/>
           <w:lang w:val="pt-BR"/>
         </w:rPr>
-        <w:t xml:space="preserve">( </w:t>
-      </w:r>
-      <w:r>
-        <w:rPr>
-          <w:rFonts w:cs="Arial"/>
-          <w:lang w:val="pt-BR"/>
-        </w:rPr>
-        <w:t>{temDiagClinic ? “X” : “”}</w:t>
-      </w:r>
-      <w:r>
-        <w:rPr>
-          <w:rFonts w:cs="Arial"/>
-          <w:lang w:val="pt-BR"/>
-        </w:rPr>
-        <w:t xml:space="preserve"> </w:t>
+        <w:t xml:space="preserve">( {temDiagClinic ? “X” : “”} </w:t>
       </w:r>
       <w:r>
         <w:rPr>
@@ -506,14 +489,112 @@
           <w:rFonts w:cs="Arial"/>
           <w:lang w:val="pt-BR"/>
         </w:rPr>
-        <w:t xml:space="preserve">( </w:t>
-      </w:r>
-      <w:r>
-        <w:rPr>
-          <w:rFonts w:cs="Arial"/>
-          <w:lang w:val="pt-BR"/>
-        </w:rPr>
-        <w:t>{temRelatoPedag ? “X” : “”}</w:t>
+        <w:t xml:space="preserve">( {temRelatoPedag ? “X” : “”} </w:t>
+      </w:r>
+      <w:r>
+        <w:rPr>
+          <w:rFonts w:cs="Arial"/>
+        </w:rPr>
+        <w:t>) RELATÓRIO PEDAGÓGICO</w:t>
+      </w:r>
+    </w:p>
+    <w:p>
+      <w:pPr>
+        <w:pStyle w:val="Normal"/>
+        <w:spacing w:lineRule="auto" w:line="480"/>
+        <w:jc w:val="both"/>
+        <w:rPr>
+          <w:rFonts w:cs="Arial"/>
+          <w:lang w:val="pt-BR"/>
+        </w:rPr>
+      </w:pPr>
+      <w:r>
+        <w:rPr>
+          <w:rFonts w:cs="Arial"/>
+        </w:rPr>
+        <w:t>DIAGNÓSTICO</w:t>
+      </w:r>
+      <w:r>
+        <w:rPr>
+          <w:rFonts w:cs="Arial"/>
+          <w:lang w:val="pt-BR"/>
+        </w:rPr>
+        <w:t>: {diagnostico}</w:t>
+      </w:r>
+    </w:p>
+    <w:p>
+      <w:pPr>
+        <w:pStyle w:val="Normal"/>
+        <w:spacing w:lineRule="auto" w:line="480"/>
+        <w:jc w:val="both"/>
+        <w:rPr>
+          <w:rFonts w:cs="Arial"/>
+          <w:lang w:val="pt-BR"/>
+        </w:rPr>
+      </w:pPr>
+      <w:r>
+        <w:rPr>
+          <w:rFonts w:cs="Arial"/>
+        </w:rPr>
+        <w:t>ATENDIMENTOS CLINICOS EXTERNOS:</w:t>
+      </w:r>
+      <w:r>
+        <w:rPr>
+          <w:rFonts w:cs="Arial"/>
+          <w:lang w:val="pt-BR"/>
+        </w:rPr>
+        <w:t xml:space="preserve"> {atendClinExt}</w:t>
+      </w:r>
+    </w:p>
+    <w:p>
+      <w:pPr>
+        <w:pStyle w:val="Normal"/>
+        <w:spacing w:lineRule="auto" w:line="480"/>
+        <w:jc w:val="both"/>
+        <w:rPr>
+          <w:rFonts w:ascii="Arial" w:hAnsi="Arial" w:cs="Arial"/>
+        </w:rPr>
+      </w:pPr>
+      <w:r>
+        <w:rPr>
+          <w:rFonts w:cs="Arial"/>
+        </w:rPr>
+        <w:t>TEM CONVULSÕES? {temConvul ? “SIM” : “NÃO”}</w:t>
+      </w:r>
+    </w:p>
+    <w:p>
+      <w:pPr>
+        <w:pStyle w:val="Normal"/>
+        <w:spacing w:lineRule="auto" w:line="480"/>
+        <w:jc w:val="both"/>
+        <w:rPr>
+          <w:rFonts w:ascii="Arial" w:hAnsi="Arial" w:cs="Arial"/>
+        </w:rPr>
+      </w:pPr>
+      <w:r>
+        <w:rPr>
+          <w:rFonts w:cs="Arial"/>
+        </w:rPr>
+        <w:t>FAZ USO DE MEDICAÇÃO? {fazUsoMed ? “SIM” : “NÃO”}</w:t>
+        <w:tab/>
+        <w:t xml:space="preserve"> QUAL? {medicacao}</w:t>
+      </w:r>
+    </w:p>
+    <w:p>
+      <w:pPr>
+        <w:pStyle w:val="Normal"/>
+        <w:spacing w:lineRule="auto" w:line="480"/>
+        <w:jc w:val="both"/>
+        <w:rPr>
+          <w:rFonts w:ascii="Arial" w:hAnsi="Arial" w:cs="Arial"/>
+        </w:rPr>
+      </w:pPr>
+      <w:r>
+        <w:rPr>
+          <w:rFonts w:cs="Arial"/>
+        </w:rPr>
+        <w:t>CONVÊNIO MÉDICO: {temConvMed ? “SIM” : “NÃO”}</w:t>
+        <w:tab/>
       </w:r>
       <w:r>
         <w:rPr>
@@ -526,272 +607,93 @@
         <w:rPr>
           <w:rFonts w:cs="Arial"/>
         </w:rPr>
-        <w:t>) RELATÓRIO PEDAGÓGICO</w:t>
-      </w:r>
-    </w:p>
-    <w:p>
-      <w:pPr>
-        <w:pStyle w:val="Normal"/>
-        <w:spacing w:lineRule="auto" w:line="480"/>
-        <w:jc w:val="both"/>
-        <w:rPr>
-          <w:rFonts w:cs="Arial"/>
-          <w:lang w:val="pt-BR"/>
-        </w:rPr>
-      </w:pPr>
-      <w:r>
-        <w:rPr>
-          <w:rFonts w:cs="Arial"/>
-        </w:rPr>
-        <w:t>DIAGNÓSTICO</w:t>
-      </w:r>
-      <w:r>
-        <w:rPr>
-          <w:rFonts w:cs="Arial"/>
-          <w:lang w:val="pt-BR"/>
-        </w:rPr>
-        <w:t>: {diagnostico}</w:t>
-      </w:r>
-    </w:p>
-    <w:p>
-      <w:pPr>
-        <w:pStyle w:val="Normal"/>
-        <w:spacing w:lineRule="auto" w:line="480"/>
-        <w:jc w:val="both"/>
-        <w:rPr>
-          <w:rFonts w:cs="Arial"/>
-          <w:lang w:val="pt-BR"/>
-        </w:rPr>
-      </w:pPr>
-      <w:r>
-        <w:rPr>
-          <w:rFonts w:cs="Arial"/>
-        </w:rPr>
-        <w:t>ATENDIMENTOS CLINICOS EXTERNOS:</w:t>
-      </w:r>
-      <w:r>
-        <w:rPr>
-          <w:rFonts w:cs="Arial"/>
-          <w:lang w:val="pt-BR"/>
-        </w:rPr>
-        <w:t xml:space="preserve"> {atendClinExt}</w:t>
-      </w:r>
-    </w:p>
-    <w:p>
-      <w:pPr>
-        <w:pStyle w:val="Normal"/>
-        <w:spacing w:lineRule="auto" w:line="480"/>
-        <w:jc w:val="both"/>
-        <w:rPr>
-          <w:rFonts w:ascii="Arial" w:hAnsi="Arial" w:cs="Arial"/>
-        </w:rPr>
-      </w:pPr>
-      <w:r>
-        <w:rPr>
-          <w:rFonts w:cs="Arial"/>
-        </w:rPr>
-        <w:t xml:space="preserve">TEM CONVULSÕES? </w:t>
-      </w:r>
-      <w:r>
-        <w:rPr>
-          <w:rFonts w:cs="Arial"/>
-        </w:rPr>
-        <w:t>{temConvul ? “SIM” : “NÃO”}</w:t>
-      </w:r>
-    </w:p>
-    <w:p>
-      <w:pPr>
-        <w:pStyle w:val="Normal"/>
-        <w:spacing w:lineRule="auto" w:line="480"/>
-        <w:jc w:val="both"/>
-        <w:rPr>
-          <w:rFonts w:ascii="Arial" w:hAnsi="Arial" w:cs="Arial"/>
-        </w:rPr>
-      </w:pPr>
-      <w:r>
-        <w:rPr>
-          <w:rFonts w:cs="Arial"/>
-        </w:rPr>
-        <w:t xml:space="preserve">FAZ USO DE MEDICAÇÃO? </w:t>
-      </w:r>
-      <w:r>
-        <w:rPr>
-          <w:rFonts w:cs="Arial"/>
-        </w:rPr>
-        <w:t>{fazUsoMed ? “SIM” : “NÃO”}</w:t>
+        <w:t>QUAL? {convenioMed}</w:t>
+      </w:r>
+    </w:p>
+    <w:p>
+      <w:pPr>
+        <w:pStyle w:val="Normal"/>
+        <w:spacing w:lineRule="auto" w:line="480"/>
+        <w:jc w:val="both"/>
+        <w:rPr>
+          <w:rFonts w:ascii="Arial" w:hAnsi="Arial" w:cs="Arial"/>
+        </w:rPr>
+      </w:pPr>
+      <w:r>
+        <w:rPr>
+          <w:rFonts w:cs="Arial"/>
+        </w:rPr>
+        <w:t>CARTEIRINHA DE TRANSPORTE: {temCartTransp ? “SIM” : “NÃO”}</w:t>
+      </w:r>
+    </w:p>
+    <w:p>
+      <w:pPr>
+        <w:pStyle w:val="Normal"/>
+        <w:spacing w:lineRule="auto" w:line="480"/>
+        <w:jc w:val="both"/>
+        <w:rPr>
+          <w:rFonts w:ascii="Arial" w:hAnsi="Arial" w:cs="Arial"/>
+        </w:rPr>
+      </w:pPr>
+      <w:r>
+        <w:rPr>
+          <w:rFonts w:cs="Arial"/>
+        </w:rPr>
+        <w:t>VAI REGULARMENTE AO MÉDICO? {vaiRegMedico ? “SIM” : “NÃO”}</w:t>
+      </w:r>
+    </w:p>
+    <w:p>
+      <w:pPr>
+        <w:pStyle w:val="Normal"/>
+        <w:spacing w:lineRule="auto" w:line="480"/>
+        <w:jc w:val="both"/>
+        <w:rPr>
+          <w:rFonts w:ascii="Arial" w:hAnsi="Arial" w:cs="Arial"/>
+        </w:rPr>
+      </w:pPr>
+      <w:r>
+        <w:rPr>
+          <w:rFonts w:cs="Arial"/>
+        </w:rPr>
+        <w:t>CARTÃO DO SUS:</w:t>
+      </w:r>
+      <w:r>
+        <w:rPr>
+          <w:rFonts w:cs="Arial"/>
+          <w:lang w:val="pt-BR"/>
+        </w:rPr>
+        <w:t xml:space="preserve"> {cartaoSus} </w:t>
+      </w:r>
+      <w:r>
+        <w:rPr>
+          <w:rFonts w:cs="Arial"/>
+        </w:rPr>
+        <w:t>VACINAÇÃO EM DIA?</w:t>
+      </w:r>
+      <w:r>
+        <w:rPr>
+          <w:rFonts w:cs="Arial"/>
+          <w:lang w:val="pt-BR"/>
+        </w:rPr>
+        <w:t xml:space="preserve"> {vacinaEmDias ? “SIM” : “NÃO”}</w:t>
+      </w:r>
+    </w:p>
+    <w:p>
+      <w:pPr>
+        <w:pStyle w:val="Normal"/>
+        <w:spacing w:lineRule="auto" w:line="480"/>
+        <w:jc w:val="both"/>
+        <w:rPr>
+          <w:rFonts w:cs="Arial"/>
+          <w:lang w:val="pt-BR"/>
+        </w:rPr>
+      </w:pPr>
+      <w:r>
+        <w:rPr>
+          <w:rFonts w:cs="Arial"/>
+        </w:rPr>
+        <w:t>TEVE ALGUMA DOENÇA CONTAGIOSA? {teveDoenContagi ? “SIM” : “NÃO”}</w:t>
         <w:tab/>
-      </w:r>
-      <w:r>
-        <w:rPr>
-          <w:rFonts w:cs="Arial"/>
-        </w:rPr>
-        <w:t xml:space="preserve"> QUAL? {medicacao}</w:t>
-      </w:r>
-    </w:p>
-    <w:p>
-      <w:pPr>
-        <w:pStyle w:val="Normal"/>
-        <w:spacing w:lineRule="auto" w:line="480"/>
-        <w:jc w:val="both"/>
-        <w:rPr>
-          <w:rFonts w:ascii="Arial" w:hAnsi="Arial" w:cs="Arial"/>
-        </w:rPr>
-      </w:pPr>
-      <w:r>
-        <w:rPr>
-          <w:rFonts w:cs="Arial"/>
-        </w:rPr>
-        <w:t xml:space="preserve">CONVÊNIO MÉDICO: </w:t>
-      </w:r>
-      <w:r>
-        <w:rPr>
-          <w:rFonts w:cs="Arial"/>
-        </w:rPr>
-        <w:t>{temConvMed ? “SIM” : “NÃO”}</w:t>
-        <w:tab/>
-      </w:r>
-      <w:r>
-        <w:rPr>
-          <w:rFonts w:cs="Arial"/>
-          <w:lang w:val="pt-BR"/>
-        </w:rPr>
-        <w:t xml:space="preserve"> </w:t>
-      </w:r>
-      <w:r>
-        <w:rPr>
-          <w:rFonts w:cs="Arial"/>
-        </w:rPr>
-        <w:t>QUAL? {convenioMed}</w:t>
-      </w:r>
-    </w:p>
-    <w:p>
-      <w:pPr>
-        <w:pStyle w:val="Normal"/>
-        <w:spacing w:lineRule="auto" w:line="480"/>
-        <w:jc w:val="both"/>
-        <w:rPr>
-          <w:rFonts w:ascii="Arial" w:hAnsi="Arial" w:cs="Arial"/>
-        </w:rPr>
-      </w:pPr>
-      <w:r>
-        <w:rPr>
-          <w:rFonts w:cs="Arial"/>
-        </w:rPr>
-        <w:t xml:space="preserve">CARTEIRINHA DE TRANSPORTE: </w:t>
-      </w:r>
-      <w:r>
-        <w:rPr>
-          <w:rFonts w:cs="Arial"/>
-        </w:rPr>
-        <w:t>{temCartTransp ? “SIM” : “NÃO”}</w:t>
-      </w:r>
-    </w:p>
-    <w:p>
-      <w:pPr>
-        <w:pStyle w:val="Normal"/>
-        <w:spacing w:lineRule="auto" w:line="480"/>
-        <w:jc w:val="both"/>
-        <w:rPr>
-          <w:rFonts w:ascii="Arial" w:hAnsi="Arial" w:cs="Arial"/>
-        </w:rPr>
-      </w:pPr>
-      <w:r>
-        <w:rPr>
-          <w:rFonts w:cs="Arial"/>
-        </w:rPr>
-        <w:t xml:space="preserve">VAI REGULARMENTE AO MÉDICO? </w:t>
-      </w:r>
-      <w:r>
-        <w:rPr>
-          <w:rFonts w:cs="Arial"/>
-        </w:rPr>
-        <w:t>{vaiRegMedico ? “SIM” : “NÃO”}</w:t>
-      </w:r>
-    </w:p>
-    <w:p>
-      <w:pPr>
-        <w:pStyle w:val="Normal"/>
-        <w:spacing w:lineRule="auto" w:line="480"/>
-        <w:jc w:val="both"/>
-        <w:rPr>
-          <w:rFonts w:ascii="Arial" w:hAnsi="Arial" w:cs="Arial"/>
-        </w:rPr>
-      </w:pPr>
-      <w:r>
-        <w:rPr>
-          <w:rFonts w:cs="Arial"/>
-        </w:rPr>
-        <w:t>CARTÃO DO SUS:</w:t>
-      </w:r>
-      <w:r>
-        <w:rPr>
-          <w:rFonts w:cs="Arial"/>
-          <w:lang w:val="pt-BR"/>
-        </w:rPr>
-        <w:t xml:space="preserve"> </w:t>
-      </w:r>
-      <w:r>
-        <w:rPr>
-          <w:rFonts w:cs="Arial"/>
-          <w:lang w:val="pt-BR"/>
-        </w:rPr>
-        <w:t>{cartaoSus}</w:t>
-      </w:r>
-      <w:r>
-        <w:rPr>
-          <w:rFonts w:cs="Arial"/>
-          <w:lang w:val="pt-BR"/>
-        </w:rPr>
-        <w:t xml:space="preserve"> </w:t>
-      </w:r>
-      <w:r>
-        <w:rPr>
-          <w:rFonts w:cs="Arial"/>
-        </w:rPr>
-        <w:t>VACINAÇÃO EM DIA?</w:t>
-      </w:r>
-      <w:r>
-        <w:rPr>
-          <w:rFonts w:cs="Arial"/>
-          <w:lang w:val="pt-BR"/>
-        </w:rPr>
-        <w:t xml:space="preserve"> </w:t>
-      </w:r>
-      <w:r>
-        <w:rPr>
-          <w:rFonts w:cs="Arial"/>
-          <w:lang w:val="pt-BR"/>
-        </w:rPr>
-        <w:t>{vacinaEmDias ? “SIM” : “NÃO”}</w:t>
-      </w:r>
-    </w:p>
-    <w:p>
-      <w:pPr>
-        <w:pStyle w:val="Normal"/>
-        <w:spacing w:lineRule="auto" w:line="480"/>
-        <w:jc w:val="both"/>
-        <w:rPr>
-          <w:rFonts w:cs="Arial"/>
-          <w:lang w:val="pt-BR"/>
-        </w:rPr>
-      </w:pPr>
-      <w:r>
-        <w:rPr>
-          <w:rFonts w:cs="Arial"/>
-        </w:rPr>
-        <w:t xml:space="preserve">TEVE ALGUMA DOENÇA CONTAGIOSA? </w:t>
-      </w:r>
-      <w:r>
-        <w:rPr>
-          <w:rFonts w:cs="Arial"/>
-        </w:rPr>
-        <w:t>{teveDoenContagi ? “SIM” : “NÃO”}</w:t>
-        <w:tab/>
-      </w:r>
-      <w:r>
-        <w:rPr>
-          <w:rFonts w:cs="Arial"/>
-        </w:rPr>
         <w:t xml:space="preserve"> QUAL?</w:t>
       </w:r>
       <w:r>
@@ -941,13 +843,7 @@
         <w:rPr>
           <w:rFonts w:cs="Arial"/>
         </w:rPr>
-        <w:t xml:space="preserve"> Parto: </w:t>
-      </w:r>
-      <w:r>
-        <w:rPr>
-          <w:rFonts w:cs="Arial"/>
-        </w:rPr>
-        <w:t>{tipoParto}</w:t>
+        <w:t xml:space="preserve"> Parto: {tipoParto}</w:t>
       </w:r>
     </w:p>
     <w:p>
@@ -992,18 +888,7 @@
         <w:rPr>
           <w:rFonts w:cs="Arial"/>
         </w:rPr>
-        <w:t xml:space="preserve">companhamento pré-natal? </w:t>
-      </w:r>
-      <w:r>
-        <w:rPr>
-          <w:rFonts w:cs="Arial"/>
-        </w:rPr>
-        <w:t>{fezPrenatal ? “SIM” : “NÃO”}</w:t>
-      </w:r>
-      <w:r>
-        <w:rPr>
-          <w:rFonts w:cs="Arial"/>
-        </w:rPr>
+        <w:t>companhamento pré-natal? {fezPrenatal ? “SIM” : “NÃO”}</w:t>
         <w:tab/>
         <w:t xml:space="preserve">Quanto tempo? </w:t>
       </w:r>
@@ -1064,21 +949,7 @@
           <w:rFonts w:cs="Arial"/>
           <w:lang w:val="pt-BR"/>
         </w:rPr>
-        <w:t xml:space="preserve"> </w:t>
-      </w:r>
-      <w:r>
-        <w:rPr>
-          <w:rFonts w:cs="Arial"/>
-          <w:lang w:val="pt-BR"/>
-        </w:rPr>
-        <w:t>{teveDoencaMedicamGesta ? “SIM” : “NÃO”}</w:t>
-      </w:r>
-      <w:r>
-        <w:rPr>
-          <w:rFonts w:cs="Arial"/>
-          <w:lang w:val="pt-BR"/>
-        </w:rPr>
-        <w:t xml:space="preserve"> </w:t>
+        <w:t xml:space="preserve"> {teveDoencaMedicamGesta ? “SIM” : “NÃO”} </w:t>
         <w:tab/>
       </w:r>
       <w:r>
@@ -1124,14 +995,7 @@
           <w:rFonts w:cs="Arial"/>
           <w:lang w:val="pt-BR"/>
         </w:rPr>
-        <w:t xml:space="preserve"> </w:t>
-      </w:r>
-      <w:r>
-        <w:rPr>
-          <w:rFonts w:cs="Arial"/>
-          <w:lang w:val="pt-BR"/>
-        </w:rPr>
-        <w:t>{chorou ? “SIM” : “NÃO”}</w:t>
+        <w:t xml:space="preserve"> {chorou ? “SIM” : “NÃO”}</w:t>
       </w:r>
       <w:r>
         <w:rPr>
@@ -1145,14 +1009,7 @@
           <w:rFonts w:cs="Arial"/>
           <w:lang w:val="pt-BR"/>
         </w:rPr>
-        <w:t xml:space="preserve"> </w:t>
-      </w:r>
-      <w:r>
-        <w:rPr>
-          <w:rFonts w:cs="Arial"/>
-          <w:lang w:val="pt-BR"/>
-        </w:rPr>
-        <w:t>{ficouRoxo ? “SIM” : “NÃO”}</w:t>
+        <w:t xml:space="preserve"> {ficouRoxo ? “SIM” : “NÃO”}</w:t>
       </w:r>
     </w:p>
     <w:p>
@@ -1175,14 +1032,7 @@
           <w:rFonts w:cs="Arial"/>
           <w:lang w:val="pt-BR"/>
         </w:rPr>
-        <w:t xml:space="preserve"> </w:t>
-      </w:r>
-      <w:r>
-        <w:rPr>
-          <w:rFonts w:cs="Arial"/>
-          <w:lang w:val="pt-BR"/>
-        </w:rPr>
-        <w:t>{preciOxig ? “SIM” : “NÃO”}</w:t>
+        <w:t xml:space="preserve"> {preciOxig ? “SIM” : “NÃO”}</w:t>
       </w:r>
       <w:r>
         <w:rPr>
@@ -1196,14 +1046,7 @@
           <w:rFonts w:cs="Arial"/>
           <w:lang w:val="pt-BR"/>
         </w:rPr>
-        <w:t xml:space="preserve"> </w:t>
-      </w:r>
-      <w:r>
-        <w:rPr>
-          <w:rFonts w:cs="Arial"/>
-          <w:lang w:val="pt-BR"/>
-        </w:rPr>
-        <w:t>{preciIncu ? “SIM” : “NÃO”}</w:t>
+        <w:t xml:space="preserve"> {preciIncu ? “SIM” : “NÃO”}</w:t>
       </w:r>
     </w:p>
     <w:p>
@@ -1226,14 +1069,7 @@
           <w:rFonts w:cs="Arial"/>
           <w:lang w:val="pt-BR"/>
         </w:rPr>
-        <w:t xml:space="preserve"> </w:t>
-      </w:r>
-      <w:r>
-        <w:rPr>
-          <w:rFonts w:cs="Arial"/>
-          <w:lang w:val="pt-BR"/>
-        </w:rPr>
-        <w:t>{apresIctericia ? “SIM” : “NÃO”}</w:t>
+        <w:t xml:space="preserve"> {apresIctericia ? “SIM” : “NÃO”}</w:t>
       </w:r>
     </w:p>
     <w:p>
@@ -1272,14 +1108,7 @@
           <w:rFonts w:cs="Arial"/>
           <w:lang w:val="pt-BR"/>
         </w:rPr>
-        <w:t xml:space="preserve"> </w:t>
-      </w:r>
-      <w:r>
-        <w:rPr>
-          <w:rFonts w:cs="Arial"/>
-          <w:lang w:val="pt-BR"/>
-        </w:rPr>
-        <w:t>{foiAmamentado ? “SIM” : “NÃO”}</w:t>
+        <w:t xml:space="preserve"> {foiAmamentado ? “SIM” : “NÃO”}</w:t>
       </w:r>
       <w:r>
         <w:rPr>
@@ -1310,14 +1139,7 @@
           <w:rFonts w:cs="Arial"/>
           <w:lang w:val="pt-BR"/>
         </w:rPr>
-        <w:t xml:space="preserve"> </w:t>
-      </w:r>
-      <w:r>
-        <w:rPr>
-          <w:rFonts w:cs="Arial"/>
-          <w:lang w:val="pt-BR"/>
-        </w:rPr>
-        <w:t>{usouMamadeira ? “SIM” : “NÃO”}</w:t>
+        <w:t xml:space="preserve"> {usouMamadeira ? “SIM” : “NÃO”}</w:t>
       </w:r>
       <w:r>
         <w:rPr>
@@ -2322,21 +2144,7 @@
           <w:rFonts w:cs="Arial"/>
           <w:lang w:val="pt-BR"/>
         </w:rPr>
-        <w:t xml:space="preserve">( </w:t>
-      </w:r>
-      <w:r>
-        <w:rPr>
-          <w:rFonts w:cs="Arial"/>
-          <w:lang w:val="pt-BR"/>
-        </w:rPr>
-        <w:t>{alimentaSo ? “X” : “”}</w:t>
-      </w:r>
-      <w:r>
-        <w:rPr>
-          <w:rFonts w:cs="Arial"/>
-          <w:lang w:val="pt-BR"/>
-        </w:rPr>
-        <w:t xml:space="preserve"> )</w:t>
+        <w:t>( {alimentaSo ? “X” : “”} )</w:t>
       </w:r>
       <w:r>
         <w:rPr>
@@ -2380,14 +2188,7 @@
           <w:rFonts w:cs="Arial"/>
           <w:lang w:val="pt-BR"/>
         </w:rPr>
-        <w:t xml:space="preserve"> </w:t>
-      </w:r>
-      <w:r>
-        <w:rPr>
-          <w:rFonts w:cs="Arial"/>
-          <w:lang w:val="pt-BR"/>
-        </w:rPr>
-        <w:t>{freqEscola ? “SIM” : “NÃO”}</w:t>
+        <w:t xml:space="preserve"> {freqEscola ? “SIM” : “NÃO”}</w:t>
       </w:r>
       <w:r>
         <w:rPr>
@@ -2424,14 +2225,7 @@
           <w:rFonts w:cs="Arial"/>
           <w:lang w:val="pt-BR"/>
         </w:rPr>
-        <w:t xml:space="preserve"> </w:t>
-      </w:r>
-      <w:r>
-        <w:rPr>
-          <w:rFonts w:cs="Arial"/>
-          <w:lang w:val="pt-BR"/>
-        </w:rPr>
-        <w:t>{fazAmigosFac ? “SIM” : “NÃO”}</w:t>
+        <w:t xml:space="preserve"> {fazAmigosFac ? “SIM” : “NÃO”}</w:t>
       </w:r>
     </w:p>
     <w:p>
@@ -2454,14 +2248,7 @@
           <w:rFonts w:cs="Arial"/>
           <w:lang w:val="pt-BR"/>
         </w:rPr>
-        <w:t xml:space="preserve"> </w:t>
-      </w:r>
-      <w:r>
-        <w:rPr>
-          <w:rFonts w:cs="Arial"/>
-          <w:lang w:val="pt-BR"/>
-        </w:rPr>
-        <w:t>{adaptaFacMeio ? “SIM” : “NÃO”}</w:t>
+        <w:t xml:space="preserve"> {adaptaFacMeio ? “SIM” : “NÃO”}</w:t>
       </w:r>
     </w:p>
     <w:p>
@@ -2499,40 +2286,22 @@
         <w:rPr>
           <w:rFonts w:cs="Arial"/>
         </w:rPr>
-        <w:t xml:space="preserve">Escolha de grupo: </w:t>
-      </w:r>
-      <w:r>
-        <w:rPr>
-          <w:rFonts w:cs="Arial"/>
-        </w:rPr>
-        <w:t>{grupsBrinca}</w:t>
-      </w:r>
-    </w:p>
-    <w:p>
-      <w:pPr>
-        <w:pStyle w:val="Normal"/>
-        <w:spacing w:lineRule="auto" w:line="480"/>
-        <w:rPr>
-          <w:rFonts w:ascii="Arial" w:hAnsi="Arial" w:cs="Arial"/>
-        </w:rPr>
-      </w:pPr>
-      <w:r>
-        <w:rPr>
-          <w:rFonts w:cs="Arial"/>
-        </w:rPr>
-        <w:t xml:space="preserve">Distrações preferidas: </w:t>
-      </w:r>
-      <w:r>
-        <w:rPr>
-          <w:rFonts w:cs="Arial"/>
-        </w:rPr>
-        <w:t>{distPref}</w:t>
-      </w:r>
-      <w:r>
-        <w:rPr>
-          <w:rFonts w:cs="Arial"/>
-        </w:rPr>
-        <w:t>. Quais?</w:t>
+        <w:t>Escolha de grupo: {grupsBrinca}</w:t>
+      </w:r>
+    </w:p>
+    <w:p>
+      <w:pPr>
+        <w:pStyle w:val="Normal"/>
+        <w:spacing w:lineRule="auto" w:line="480"/>
+        <w:rPr>
+          <w:rFonts w:ascii="Arial" w:hAnsi="Arial" w:cs="Arial"/>
+        </w:rPr>
+      </w:pPr>
+      <w:r>
+        <w:rPr>
+          <w:rFonts w:cs="Arial"/>
+        </w:rPr>
+        <w:t>Distrações preferidas: {distPref}. Quais?</w:t>
       </w:r>
       <w:r>
         <w:rPr>
@@ -2554,85 +2323,37 @@
         <w:rPr>
           <w:rFonts w:cs="Arial"/>
         </w:rPr>
-        <w:t>Atitudes sociais predominantes:</w:t>
-      </w:r>
-      <w:r>
-        <w:rPr>
-          <w:rFonts w:cs="Arial"/>
-        </w:rPr>
-        <w:t xml:space="preserve"> </w:t>
-      </w:r>
-      <w:r>
-        <w:rPr>
-          <w:rFonts w:cs="Arial"/>
-        </w:rPr>
-        <w:t>{</w:t>
-      </w:r>
-      <w:r>
-        <w:rPr>
-          <w:rFonts w:cs="Arial"/>
-        </w:rPr>
-        <w:t>atitudSociPred</w:t>
-      </w:r>
-      <w:r>
-        <w:rPr>
-          <w:rFonts w:cs="Arial"/>
-        </w:rPr>
-        <w:t>}</w:t>
-      </w:r>
-    </w:p>
-    <w:p>
-      <w:pPr>
-        <w:pStyle w:val="Normal"/>
-        <w:spacing w:lineRule="auto" w:line="480"/>
-        <w:rPr>
-          <w:rFonts w:ascii="Arial" w:hAnsi="Arial" w:cs="Arial"/>
-        </w:rPr>
-      </w:pPr>
-      <w:r>
-        <w:rPr>
-          <w:rFonts w:cs="Arial"/>
-        </w:rPr>
-        <w:t>Emocionais:</w:t>
-      </w:r>
-      <w:r>
-        <w:rPr>
-          <w:rFonts w:cs="Arial"/>
-        </w:rPr>
-        <w:t xml:space="preserve"> </w:t>
-      </w:r>
-      <w:r>
-        <w:rPr>
-          <w:rFonts w:cs="Arial"/>
-        </w:rPr>
-        <w:t>{atitudEmociPred}</w:t>
-      </w:r>
-    </w:p>
-    <w:p>
-      <w:pPr>
-        <w:pStyle w:val="Normal"/>
-        <w:spacing w:lineRule="auto" w:line="480"/>
-        <w:rPr>
-          <w:rFonts w:ascii="Arial" w:hAnsi="Arial" w:cs="Arial"/>
-        </w:rPr>
-      </w:pPr>
-      <w:r>
-        <w:rPr>
-          <w:rFonts w:cs="Arial"/>
-        </w:rPr>
-        <w:t>Sono:</w:t>
-      </w:r>
-      <w:r>
-        <w:rPr>
-          <w:rFonts w:cs="Arial"/>
-        </w:rPr>
-        <w:t xml:space="preserve"> </w:t>
-      </w:r>
-      <w:r>
-        <w:rPr>
-          <w:rFonts w:cs="Arial"/>
-        </w:rPr>
-        <w:t>{sono}</w:t>
+        <w:t>Atitudes sociais predominantes: {atitudSociPred}</w:t>
+      </w:r>
+    </w:p>
+    <w:p>
+      <w:pPr>
+        <w:pStyle w:val="Normal"/>
+        <w:spacing w:lineRule="auto" w:line="480"/>
+        <w:rPr>
+          <w:rFonts w:ascii="Arial" w:hAnsi="Arial" w:cs="Arial"/>
+        </w:rPr>
+      </w:pPr>
+      <w:r>
+        <w:rPr>
+          <w:rFonts w:cs="Arial"/>
+        </w:rPr>
+        <w:t>Emocionais: {atitudEmociPred}</w:t>
+      </w:r>
+    </w:p>
+    <w:p>
+      <w:pPr>
+        <w:pStyle w:val="Normal"/>
+        <w:spacing w:lineRule="auto" w:line="480"/>
+        <w:rPr>
+          <w:rFonts w:ascii="Arial" w:hAnsi="Arial" w:cs="Arial"/>
+        </w:rPr>
+      </w:pPr>
+      <w:r>
+        <w:rPr>
+          <w:rFonts w:cs="Arial"/>
+        </w:rPr>
+        <w:t>Sono: {sono}</w:t>
       </w:r>
     </w:p>
     <w:p>

</xml_diff>